<commit_message>
Update case study documents
</commit_message>
<xml_diff>
--- a/case study 1.docx
+++ b/case study 1.docx
@@ -399,23 +399,7 @@
           <w:rFonts w:ascii="Times New Roman" w:hAnsi="Times New Roman" w:cs="Times New Roman"/>
           <w:b/>
         </w:rPr>
-        <w:t xml:space="preserve">Case Study Topic: </w:t>
-      </w:r>
-      <w:proofErr w:type="spellStart"/>
-      <w:r>
-        <w:rPr>
-          <w:rFonts w:ascii="Times New Roman" w:hAnsi="Times New Roman" w:cs="Times New Roman"/>
-          <w:b/>
-        </w:rPr>
-        <w:t>MediFlow</w:t>
-      </w:r>
-      <w:proofErr w:type="spellEnd"/>
-      <w:r>
-        <w:rPr>
-          <w:rFonts w:ascii="Times New Roman" w:hAnsi="Times New Roman" w:cs="Times New Roman"/>
-          <w:b/>
-        </w:rPr>
-        <w:t xml:space="preserve"> Hospital Patient Index using BST &amp; AVL Tree (Set 1 Q1)</w:t>
+        <w:t>Case Study Topic: MediFlow Hospital Patient Index using BST &amp; AVL Tree (Set 1 Q1)</w:t>
       </w:r>
     </w:p>
     <w:p>
@@ -447,21 +431,7 @@
         <w:rPr>
           <w:rFonts w:ascii="Times New Roman" w:hAnsi="Times New Roman" w:cs="Times New Roman"/>
         </w:rPr>
-        <w:t xml:space="preserve">In this case study, we implemented both BST and AVL Tree to manage patient records using Patient IDs. The IDs were inserted in appointment order, resulting in a nearly sorted sequence. We observed that the BST became skewed and inefficient for searching. To overcome this issue, an AVL Tree was implemented with automatic balancing using rotations. The height and performance of both structures were compared. The results showed that AVL Trees maintain </w:t>
-      </w:r>
-      <w:proofErr w:type="gramStart"/>
-      <w:r>
-        <w:rPr>
-          <w:rFonts w:ascii="Times New Roman" w:hAnsi="Times New Roman" w:cs="Times New Roman"/>
-        </w:rPr>
-        <w:t>O(</w:t>
-      </w:r>
-      <w:proofErr w:type="gramEnd"/>
-      <w:r>
-        <w:rPr>
-          <w:rFonts w:ascii="Times New Roman" w:hAnsi="Times New Roman" w:cs="Times New Roman"/>
-        </w:rPr>
-        <w:t>log n) operations and provide faster lookups in hospital management systems.</w:t>
+        <w:t>In this case study, we implemented both BST and AVL Tree to manage patient records using Patient IDs. The IDs were inserted in appointment order, resulting in a nearly sorted sequence. We observed that the BST became skewed and inefficient for searching. To overcome this issue, an AVL Tree was implemented with automatic balancing using rotations. The height and performance of both structures were compared. The results showed that AVL Trees maintain O(log n) operations and provide faster lookups in hospital management systems.</w:t>
       </w:r>
     </w:p>
     <w:p>
@@ -562,21 +532,7 @@
         <w:rPr>
           <w:rFonts w:ascii="Times New Roman" w:hAnsi="Times New Roman" w:cs="Times New Roman"/>
         </w:rPr>
-        <w:t xml:space="preserve">Verified AVL maintained </w:t>
-      </w:r>
-      <w:proofErr w:type="gramStart"/>
-      <w:r>
-        <w:rPr>
-          <w:rFonts w:ascii="Times New Roman" w:hAnsi="Times New Roman" w:cs="Times New Roman"/>
-        </w:rPr>
-        <w:t>O(</w:t>
-      </w:r>
-      <w:proofErr w:type="gramEnd"/>
-      <w:r>
-        <w:rPr>
-          <w:rFonts w:ascii="Times New Roman" w:hAnsi="Times New Roman" w:cs="Times New Roman"/>
-        </w:rPr>
-        <w:t>log n) operations.</w:t>
+        <w:t>Verified AVL maintained O(log n) operations.</w:t>
       </w:r>
     </w:p>
     <w:p>
@@ -611,6 +567,7 @@
       <w:r>
         <w:rPr>
           <w:rFonts w:ascii="Times New Roman" w:hAnsi="Times New Roman" w:cs="Times New Roman"/>
+          <w:noProof/>
         </w:rPr>
         <w:drawing>
           <wp:inline distT="0" distB="0" distL="0" distR="0" wp14:anchorId="5FFD442F" wp14:editId="69BD2D0E">
@@ -719,27 +676,7 @@
           <w:bCs/>
           <w:lang w:val="en-IN"/>
         </w:rPr>
-        <w:t>Patient IDs (</w:t>
-      </w:r>
-      <w:proofErr w:type="spellStart"/>
-      <w:r>
-        <w:rPr>
-          <w:rFonts w:ascii="Times New Roman" w:hAnsi="Times New Roman" w:cs="Times New Roman"/>
-          <w:b/>
-          <w:bCs/>
-          <w:lang w:val="en-IN"/>
-        </w:rPr>
-        <w:t>Inorder</w:t>
-      </w:r>
-      <w:proofErr w:type="spellEnd"/>
-      <w:r>
-        <w:rPr>
-          <w:rFonts w:ascii="Times New Roman" w:hAnsi="Times New Roman" w:cs="Times New Roman"/>
-          <w:b/>
-          <w:bCs/>
-          <w:lang w:val="en-IN"/>
-        </w:rPr>
-        <w:t xml:space="preserve"> Traversal)</w:t>
+        <w:t>Patient IDs (Inorder Traversal)</w:t>
       </w:r>
     </w:p>
     <w:p>
@@ -798,27 +735,7 @@
           <w:bCs/>
           <w:lang w:val="en-IN"/>
         </w:rPr>
-        <w:t>Final AVL Tree (</w:t>
-      </w:r>
-      <w:proofErr w:type="spellStart"/>
-      <w:r>
-        <w:rPr>
-          <w:rFonts w:ascii="Times New Roman" w:hAnsi="Times New Roman" w:cs="Times New Roman"/>
-          <w:b/>
-          <w:bCs/>
-          <w:lang w:val="en-IN"/>
-        </w:rPr>
-        <w:t>Inorder</w:t>
-      </w:r>
-      <w:proofErr w:type="spellEnd"/>
-      <w:r>
-        <w:rPr>
-          <w:rFonts w:ascii="Times New Roman" w:hAnsi="Times New Roman" w:cs="Times New Roman"/>
-          <w:b/>
-          <w:bCs/>
-          <w:lang w:val="en-IN"/>
-        </w:rPr>
-        <w:t xml:space="preserve"> Traversal After Deletions)</w:t>
+        <w:t>Final AVL Tree (Inorder Traversal After Deletions)</w:t>
       </w:r>
     </w:p>
     <w:p>
@@ -1050,7 +967,6 @@
         </w:rPr>
         <w:t xml:space="preserve">AVL Search: </w:t>
       </w:r>
-      <w:proofErr w:type="gramStart"/>
       <w:r>
         <w:rPr>
           <w:rFonts w:ascii="Times New Roman" w:hAnsi="Times New Roman" w:cs="Times New Roman"/>
@@ -1058,17 +974,7 @@
           <w:bCs/>
           <w:lang w:val="en-IN"/>
         </w:rPr>
-        <w:t>O(</w:t>
-      </w:r>
-      <w:proofErr w:type="gramEnd"/>
-      <w:r>
-        <w:rPr>
-          <w:rFonts w:ascii="Times New Roman" w:hAnsi="Times New Roman" w:cs="Times New Roman"/>
-          <w:b/>
-          <w:bCs/>
-          <w:lang w:val="en-IN"/>
-        </w:rPr>
-        <w:t>log n)</w:t>
+        <w:t>O(log n)</w:t>
       </w:r>
     </w:p>
     <w:p>
@@ -1090,7 +996,6 @@
         </w:rPr>
         <w:t xml:space="preserve">AVL Insert: </w:t>
       </w:r>
-      <w:proofErr w:type="gramStart"/>
       <w:r>
         <w:rPr>
           <w:rFonts w:ascii="Times New Roman" w:hAnsi="Times New Roman" w:cs="Times New Roman"/>
@@ -1098,17 +1003,7 @@
           <w:bCs/>
           <w:lang w:val="en-IN"/>
         </w:rPr>
-        <w:t>O(</w:t>
-      </w:r>
-      <w:proofErr w:type="gramEnd"/>
-      <w:r>
-        <w:rPr>
-          <w:rFonts w:ascii="Times New Roman" w:hAnsi="Times New Roman" w:cs="Times New Roman"/>
-          <w:b/>
-          <w:bCs/>
-          <w:lang w:val="en-IN"/>
-        </w:rPr>
-        <w:t>log n)</w:t>
+        <w:t>O(log n)</w:t>
       </w:r>
     </w:p>
     <w:p>
@@ -1130,7 +1025,6 @@
         </w:rPr>
         <w:t xml:space="preserve">AVL Delete: </w:t>
       </w:r>
-      <w:proofErr w:type="gramStart"/>
       <w:r>
         <w:rPr>
           <w:rFonts w:ascii="Times New Roman" w:hAnsi="Times New Roman" w:cs="Times New Roman"/>
@@ -1138,17 +1032,7 @@
           <w:bCs/>
           <w:lang w:val="en-IN"/>
         </w:rPr>
-        <w:t>O(</w:t>
-      </w:r>
-      <w:proofErr w:type="gramEnd"/>
-      <w:r>
-        <w:rPr>
-          <w:rFonts w:ascii="Times New Roman" w:hAnsi="Times New Roman" w:cs="Times New Roman"/>
-          <w:b/>
-          <w:bCs/>
-          <w:lang w:val="en-IN"/>
-        </w:rPr>
-        <w:t>log n)</w:t>
+        <w:t>O(log n)</w:t>
       </w:r>
     </w:p>
     <w:p>
@@ -1170,7 +1054,6 @@
         </w:rPr>
         <w:t xml:space="preserve">AVL Rotation (LL, RR, LR, RL): </w:t>
       </w:r>
-      <w:proofErr w:type="gramStart"/>
       <w:r>
         <w:rPr>
           <w:rFonts w:ascii="Times New Roman" w:hAnsi="Times New Roman" w:cs="Times New Roman"/>
@@ -1178,9 +1061,28 @@
           <w:bCs/>
           <w:lang w:val="en-IN"/>
         </w:rPr>
-        <w:t>O(</w:t>
+        <w:t>O(1)</w:t>
       </w:r>
-      <w:proofErr w:type="gramEnd"/>
+    </w:p>
+    <w:p>
+      <w:pPr>
+        <w:spacing w:after="0" w:line="240" w:lineRule="auto"/>
+        <w:rPr>
+          <w:rFonts w:ascii="Times New Roman" w:hAnsi="Times New Roman" w:cs="Times New Roman"/>
+          <w:b/>
+          <w:bCs/>
+          <w:lang w:val="en-IN"/>
+        </w:rPr>
+      </w:pPr>
+    </w:p>
+    <w:p>
+      <w:pPr>
+        <w:spacing w:after="0" w:line="240" w:lineRule="auto"/>
+        <w:rPr>
+          <w:rFonts w:ascii="Times New Roman" w:hAnsi="Times New Roman" w:cs="Times New Roman"/>
+          <w:lang w:val="en-IN"/>
+        </w:rPr>
+      </w:pPr>
       <w:r>
         <w:rPr>
           <w:rFonts w:ascii="Times New Roman" w:hAnsi="Times New Roman" w:cs="Times New Roman"/>
@@ -1188,46 +1090,7 @@
           <w:bCs/>
           <w:lang w:val="en-IN"/>
         </w:rPr>
-        <w:t>1)</w:t>
-      </w:r>
-    </w:p>
-    <w:p>
-      <w:pPr>
-        <w:spacing w:after="0" w:line="240" w:lineRule="auto"/>
-        <w:rPr>
-          <w:rFonts w:ascii="Times New Roman" w:hAnsi="Times New Roman" w:cs="Times New Roman"/>
-          <w:b/>
-          <w:bCs/>
-          <w:lang w:val="en-IN"/>
-        </w:rPr>
-      </w:pPr>
-    </w:p>
-    <w:p>
-      <w:pPr>
-        <w:spacing w:after="0" w:line="240" w:lineRule="auto"/>
-        <w:rPr>
-          <w:rFonts w:ascii="Times New Roman" w:hAnsi="Times New Roman" w:cs="Times New Roman"/>
-          <w:lang w:val="en-IN"/>
-        </w:rPr>
-      </w:pPr>
-      <w:r>
-        <w:rPr>
-          <w:rFonts w:ascii="Times New Roman" w:hAnsi="Times New Roman" w:cs="Times New Roman"/>
-          <w:b/>
-          <w:bCs/>
-          <w:lang w:val="en-IN"/>
-        </w:rPr>
-        <w:t xml:space="preserve">GITHUB </w:t>
-      </w:r>
-      <w:proofErr w:type="gramStart"/>
-      <w:r>
-        <w:rPr>
-          <w:rFonts w:ascii="Times New Roman" w:hAnsi="Times New Roman" w:cs="Times New Roman"/>
-          <w:b/>
-          <w:bCs/>
-          <w:lang w:val="en-IN"/>
-        </w:rPr>
-        <w:t>LINK</w:t>
+        <w:t>GITHUB LINK</w:t>
       </w:r>
       <w:r>
         <w:rPr>
@@ -1236,14 +1099,11 @@
           <w:bCs/>
           <w:lang w:val="en-IN"/>
         </w:rPr>
-        <w:t xml:space="preserve">  :</w:t>
+        <w:t xml:space="preserve">  : </w:t>
       </w:r>
-      <w:proofErr w:type="gramEnd"/>
       <w:r>
         <w:rPr>
           <w:rFonts w:ascii="Times New Roman" w:hAnsi="Times New Roman" w:cs="Times New Roman"/>
-          <w:b/>
-          <w:bCs/>
           <w:lang w:val="en-IN"/>
         </w:rPr>
         <w:t xml:space="preserve"> </w:t>
@@ -1253,18 +1113,8 @@
           <w:rFonts w:ascii="Times New Roman" w:hAnsi="Times New Roman" w:cs="Times New Roman"/>
           <w:lang w:val="en-IN"/>
         </w:rPr>
-        <w:t xml:space="preserve"> </w:t>
+        <w:t>https://github.com/P-Shashe-Preetham/DSA-CASE-STUDIES.git</w:t>
       </w:r>
-      <w:hyperlink r:id="rId8" w:history="1">
-        <w:r>
-          <w:rPr>
-            <w:rStyle w:val="Hyperlink"/>
-            <w:rFonts w:ascii="Times New Roman" w:hAnsi="Times New Roman" w:cs="Times New Roman"/>
-            <w:lang w:val="en-IN"/>
-          </w:rPr>
-          <w:t>https://github.com/tanyasri1405/case-study-DSA.git</w:t>
-        </w:r>
-      </w:hyperlink>
     </w:p>
     <w:p>
       <w:pPr>

</xml_diff>